<commit_message>
Fix Black (2020) citation - correct to Melbourne, PLoS ONE; expand Section 2.3.3 with Cladosporium, Alternaria, Rhizopus, Mucor
</commit_message>
<xml_diff>
--- a/Chapter_Two_Literature_Review.docx
+++ b/Chapter_Two_Literature_Review.docx
@@ -343,7 +343,63 @@
           <w:rFonts w:ascii="Times New Roman" w:hAnsi="Times New Roman"/>
           <w:sz w:val="24"/>
         </w:rPr>
-        <w:t>Beyond these three genera, other fungi frequently encountered in indoor air surveys include Cladosporium (the single most common genus recovered from outdoor air in temperate regions), Alternaria, Curvularia, Rhizopus, Mucor, and various yeasts (Burge, 1990; Shelton et al., 2002). Cladosporium cladosporioides and C. herbarum, for instance, are among the most abundant airborne spore types in outdoor air worldwide, and they regularly appear in indoor samples as well, usually reflecting outdoor infiltration rather than indoor growth (Shelton et al., 2002). In tropical settings, genera such as Curvularia, Fusarium, and Bipolaris are also commonly reported from indoor environments (Adhikari et al., 2004).</w:t>
+        <w:t>Beyond Aspergillus, Penicillium, and Trichoderma, several other fungal genera are regularly encountered in indoor aeromycological surveys and warrant discussion here, both because they appear frequently in the literature and because some of them were reported in Nigerian studies directly relevant to this work.</w:t>
+      </w:r>
+    </w:p>
+    <w:p>
+      <w:pPr>
+        <w:ind w:firstLine="720"/>
+        <w:jc w:val="both"/>
+      </w:pPr>
+      <w:r>
+        <w:rPr>
+          <w:rFonts w:ascii="Times New Roman" w:hAnsi="Times New Roman"/>
+          <w:sz w:val="24"/>
+          <w:szCs w:val="24"/>
+        </w:rPr>
+        <w:t xml:space="preserve">Cladosporium is arguably the most abundant fungal genus in outdoor air on a global scale, and its spores are so prolific that the genus can dominate airborne spore counts during certain seasons, particularly in temperate climates (Shelton et al., 2002). The two most commonly encountered species, Cladosporium cladosporioides and C. herbarum, produce olive-brown to dark brown colonies with a velvety to powdery texture, and their one-celled, ellipsoidal conidia form characteristic branching chains (Barnett and Hunter, 1998). Cladosporium spores are significant allergens and have been implicated in triggering asthma and allergic rhinitis in sensitised individuals (Burge, 1990). In indoor air, the presence of Cladosporium is usually taken as an indicator of outdoor air infiltration rather than active indoor colonisation, although the genus can grow on damp window frames, bathroom surfaces, and other moisture-prone areas (Samson et al., 2010). Its absence from the isolates recovered in the present study is notable and may reflect the culture conditions used or the seasonal timing of sampling.</w:t>
+      </w:r>
+    </w:p>
+    <w:p>
+      <w:pPr>
+        <w:ind w:firstLine="720"/>
+        <w:jc w:val="both"/>
+      </w:pPr>
+      <w:r>
+        <w:rPr>
+          <w:rFonts w:ascii="Times New Roman" w:hAnsi="Times New Roman"/>
+          <w:sz w:val="24"/>
+          <w:szCs w:val="24"/>
+        </w:rPr>
+        <w:t xml:space="preserve">Alternaria is another common airborne fungal genus with established relevance to human health. Species such as Alternaria alternata are among the most important fungal allergens worldwide and have been strongly associated with the development and exacerbation of asthma, particularly in children and young adults (Burge, 1990). The genus produces large, multicellular, muriform conidia (often described as club-shaped or beak-tipped) that are readily identifiable under the microscope and distinctive in culture by their dark brown to black, woolly colonies (Barnett and Hunter, 1998). Alternaria spores are abundant in outdoor air during warm months and can infiltrate indoor environments, though the genus generally requires higher water activity than Aspergillus or Penicillium and is therefore less likely to establish persistent indoor growth unless moisture is readily available (Samson et al., 2010).</w:t>
+      </w:r>
+    </w:p>
+    <w:p>
+      <w:pPr>
+        <w:ind w:firstLine="720"/>
+        <w:jc w:val="both"/>
+      </w:pPr>
+      <w:r>
+        <w:rPr>
+          <w:rFonts w:ascii="Times New Roman" w:hAnsi="Times New Roman"/>
+          <w:sz w:val="24"/>
+          <w:szCs w:val="24"/>
+        </w:rPr>
+        <w:t xml:space="preserve">Rhizopus belongs to the order Mucorales and is one of the most frequently isolated genera from indoor air in Nigerian studies. Madukasi et al. (2021) recovered Rhizopus species from multiple sampling points within a tertiary institution in south-eastern Nigeria, noting that the genus was among the top three most common isolates alongside Aspergillus niger and Penicillium spp. Rhizopus species produce rapidly growing, cottony to fibrous colonies that can fill a Petri dish within two to three days, and are recognised microscopically by their coenocytic (non-septate) hyphae and distinctive sporangiophores bearing globose sporangia at their tips, with rhizoids anchoring the mycelium to the substrate (Barnett and Hunter, 1998). Rhizopus arrhizomus (formerly R. oryzae) is of particular clinical significance as the most common cause of mucormycosis, a severe and often life-threatening infection that affects immunocompromised patients, particularly those with poorly controlled diabetes or iron overload (Nevalainen et al., 2015). The recovery of Rhizopus from indoor air in educational buildings in Nigeria is therefore a finding of both microbiological and public health relevance.</w:t>
+      </w:r>
+    </w:p>
+    <w:p>
+      <w:pPr>
+        <w:ind w:firstLine="720"/>
+        <w:jc w:val="both"/>
+      </w:pPr>
+      <w:r>
+        <w:rPr>
+          <w:rFonts w:ascii="Times New Roman" w:hAnsi="Times New Roman"/>
+          <w:sz w:val="24"/>
+          <w:szCs w:val="24"/>
+        </w:rPr>
+        <w:t xml:space="preserve">Mucor, like Rhizopus, is a member of the Mucorales and shares many morphological and ecological characteristics with its close relative. Colonies of Mucor are typically fast-growing, cottony, and white to greyish in colour, and the genus is distinguished from Rhizopus microscopically by the absence of well-developed rhizoids at the base of the sporangiophores (Barnett and Hunter, 1998). Eze et al. (2021) reported Mucor among the fungal genera isolated from crowded indoor spaces in Port Harcourt, Nigeria, where it occurred alongside Aspergillus, Penicillium, and Cladosporium. Mucor species are also occasional agents of mucormycosis, though they are less commonly implicated than Rhizopus (Nevalainen et al., 2015). In indoor environments, both Mucor and Rhizopus are often associated with organic debris, food waste, and damp paper or cardboard, and their presence can indicate that housekeeping or waste management practices need attention (Khan and Mohan Karuppayil, 2012).</w:t>
       </w:r>
     </w:p>
     <w:p>
@@ -959,7 +1015,7 @@
           <w:rFonts w:ascii="Times New Roman" w:hAnsi="Times New Roman"/>
           <w:sz w:val="24"/>
         </w:rPr>
-        <w:t>Black, W.D. (2020). A comparison of several media types and basic techniques used to assess outdoor airborne fungi in Metropolitan Memphis, Tennessee. Journal of Occupational and Environmental Hygiene, 17(10), 426–435.</w:t>
+        <w:t>Black, W.D. (2020). A comparison of several media types and basic techniques used to assess outdoor airborne fungi in Melbourne, Australia. PLoS ONE, 15(12), e0238901.</w:t>
       </w:r>
     </w:p>
     <w:p>

</xml_diff>

<commit_message>
Expand Chapter 2: add 7 new paragraphs across sections 2.3-2.8, body text now ~5,700 words
</commit_message>
<xml_diff>
--- a/Chapter_Two_Literature_Review.docx
+++ b/Chapter_Two_Literature_Review.docx
@@ -264,6 +264,20 @@
         <w:rPr>
           <w:rFonts w:ascii="Times New Roman" w:hAnsi="Times New Roman"/>
           <w:sz w:val="24"/>
+          <w:szCs w:val="24"/>
+        </w:rPr>
+        <w:t xml:space="preserve">The ecological success of Aspergillus in indoor environments is attributable to several factors. The genus produces enormous numbers of conidia from each conidiophore head, with a single colony capable of releasing millions of spores per day into the surrounding air. These conidia are small (typically 2 to 5 micrometres in diameter), dry, and easily aerosolised by air currents, which allows them to remain suspended for extended periods and penetrate deep into the respiratory tract when inhaled (Samson et al., 2010). Furthermore, many Aspergillus species can grow on substrates that are commonly found indoors, including dust, paper, cardboard, fabric, and food residues, and they tolerate a wider range of temperature and water activity conditions than many other fungal genera (Barnett and Hunter, 1998). In buildings with even minor moisture problems, such as condensation on windows, leaky pipes, or poorly ventilated bathrooms, Aspergillus species can shift from being transient airborne contaminants to established colonisers of building surfaces (Nevalainen et al., 2015). The genus is also notable for its ability to survive and sporulate on materials that would be too nutrient-poor for most other fungi, which partly explains its ubiquity in indoor air regardless of building type or geographic location.</w:t>
+      </w:r>
+    </w:p>
+    <w:p>
+      <w:pPr>
+        <w:ind w:firstLine="720"/>
+        <w:jc w:val="both"/>
+      </w:pPr>
+      <w:r>
+        <w:rPr>
+          <w:rFonts w:ascii="Times New Roman" w:hAnsi="Times New Roman"/>
+          <w:sz w:val="24"/>
         </w:rPr>
         <w:t>Less commonly discussed but still relevant to indoor surveys are species such as Aspergillus melleus and Aspergillus japonicus. A. melleus, placed within Section Circumdati, produces yellowish-brown colonies and has been recovered from soil, stored grains, and indoor dust samples (Frisvad et al., 2004). A. japonicus, a member of Section Flavi, is notable for producing kojic acid and has been reported from soil and decaying plant material in tropical and subtropical environments. The recovery of these less common species from indoor air is not unusual, given the diversity of the genus and its broad ecological amplitude (Samson et al., 2010).</w:t>
       </w:r>
@@ -450,6 +464,20 @@
         <w:rPr>
           <w:rFonts w:ascii="Times New Roman" w:hAnsi="Times New Roman"/>
           <w:sz w:val="24"/>
+          <w:szCs w:val="24"/>
+        </w:rPr>
+        <w:t xml:space="preserve">Within educational settings, certain groups may be at heightened risk from indoor fungal exposure. Students with pre-existing conditions such as asthma, allergic rhinitis, or atopic dermatitis may experience worsened symptoms when exposed to elevated concentrations of fungal spores in classrooms and other shared spaces (Mendell et al., 2011). There is also evidence that early and sustained exposure to mould allergens during childhood can sensitise individuals who were not previously allergic, potentially leading to the development of new respiratory conditions (WHO, 2009). While most healthy adults exposed to the fungal concentrations typically found in non-problem buildings will not experience adverse effects, the situation is different for immunocompromised individuals. University populations are not typically considered a high-risk group for invasive fungal infections, but students undergoing treatment for conditions such as HIV/AIDS, diabetes, or cancer may be vulnerable to opportunistic species like Aspergillus fumigatus and the Mucorales (Mousavi et al., 2016). Staff members who spend years working in the same building may also face cumulative exposure risks. The practical implication is that even in buildings without obvious mould problems, monitoring the indoor fungal profile provides useful baseline data that can inform facility management decisions aimed at protecting the health of all building users.</w:t>
+      </w:r>
+    </w:p>
+    <w:p>
+      <w:pPr>
+        <w:ind w:firstLine="720"/>
+        <w:jc w:val="both"/>
+      </w:pPr>
+      <w:r>
+        <w:rPr>
+          <w:rFonts w:ascii="Times New Roman" w:hAnsi="Times New Roman"/>
+          <w:sz w:val="24"/>
         </w:rPr>
         <w:t>The mycotoxin issue deserves mention, although its relevance to indoor air exposure remains debated. A number of indoor fungal species, including some strains of Aspergillus flavus, A. ochraceus, A. versicolor, and Stachybotrys chartarum, are capable of producing mycotoxins on suitable substrates. Whether these toxins are present at harmful concentrations in indoor air under normal conditions is less clear, and the topic has generated considerable scientific disagreement (Nevalainen et al., 2015). In the context of the present study, it is worth noting that A. flavus was among the species recovered, and its potential for aflatoxin production is well established, although detecting mycotoxins in air samples requires specialised analytical methods that go beyond routine culture-based aeromycological surveys.</w:t>
       </w:r>
@@ -567,8 +595,9 @@
         <w:rPr>
           <w:rFonts w:ascii="Times New Roman" w:hAnsi="Times New Roman"/>
           <w:sz w:val="24"/>
+          <w:szCs w:val="24"/>
         </w:rPr>
-        <w:t>Human activity is a well-documented driver of airborne particle concentrations, including fungal spores. Walking, talking, and movement disturb settled dust and resuspend fungal propagules into the air. Crowded indoor spaces therefore tend to show higher airborne fungal concentrations than less occupied ones, all else being equal (Kallawicha et al., 2017). In educational buildings, corridors, reception areas, and other high-traffic zones may therefore be expected to have elevated fungal loads compared with individual offices or sparsely used rooms. Madukasi et al. (2021), working in a tertiary institution in south-eastern Nigeria, found that areas with higher foot traffic had significantly greater colony-forming units per plate than quieter locations, which they attributed to the resuspension of settled spores by occupants' movement.</w:t>
+        <w:t xml:space="preserve">Human activity is a well-documented driver of airborne particle concentrations, including fungal spores. Walking, talking, and movement disturb settled dust and resuspend fungal propagules into the air. Crowded indoor spaces therefore tend to show higher airborne fungal concentrations than less occupied ones, all else being equal (Kallawicha et al., 2017). In educational buildings, corridors, reception areas, and other high-traffic zones may therefore be expected to have elevated fungal loads compared with individual offices or sparsely used rooms. Madukasi et al. (2021), working in a tertiary institution in south-eastern Nigeria, found that areas with higher foot traffic had significantly greater colony-forming units per plate than quieter locations, which they attributed to the resuspension of settled spores by occupants' movement.</w:t>
       </w:r>
     </w:p>
     <w:p>
@@ -581,7 +610,7 @@
           <w:rFonts w:ascii="Times New Roman" w:hAnsi="Times New Roman"/>
           <w:sz w:val="24"/>
         </w:rPr>
-        <w:t>The diurnal variation in fungal spore concentrations is also worth noting. Several studies have reported that airborne spore levels tend to be lower in the early morning and rise through the late morning and afternoon as human activity increases and temperatures rise, before declining in the evening (Kallawicha et al., 2017; Zhang et al., 2022). This pattern is one reason why the present study collected samples at two time points (morning and afternoon), to capture any diurnal variation in fungal loads at the three buildings.</w:t>
+        <w:t>The diurnal variation in fungal spore concentrations is also worth noting. Several studies have reported that airborne spore levels tend to be lower in the early morning and rise through the late morning and afternoon as human activity increases and temperatures rise, before declining in the evening (Kallawicha et al., 2017; Zhang et al., 2022). This pattern is one reason why the present study collected samples at two time points (morning and afternoon), to capture any diurnal variation in fungal loads at the three buildings. Seasonal variation is at least as important as diurnal variation, and often more pronounced. In temperate climates, outdoor fungal spore concentrations follow a characteristic annual cycle, peaking in late summer and autumn and reaching their lowest levels in winter (Burge, 1990). In tropical and subtropical regions, the seasonal pattern is driven more by rainfall than by temperature, with fungal loads generally increasing during the wet season and declining during the dry season (Odebode et al., 2020). Yuan et al. (2022) reviewed seasonal dynamics of indoor and outdoor culturable airborne fungi across multiple climate zones and found that indoor fungal communities tracked outdoor seasonal patterns closely in naturally ventilated buildings, with the strength of the indoor-outdoor correlation varying according to building type and climate. For the present study, the fact that sampling was conducted during the rainy season in Abuja means that the results likely capture near-peak fungal diversity and abundance for the annual cycle, a point that should be considered when interpreting the findings and comparing them with studies from other seasons or climate zones.</w:t>
       </w:r>
     </w:p>
     <w:p>
@@ -625,6 +654,20 @@
     </w:p>
     <w:p>
       <w:pPr>
+        <w:ind w:firstLine="720"/>
+        <w:jc w:val="both"/>
+      </w:pPr>
+      <w:r>
+        <w:rPr>
+          <w:rFonts w:ascii="Times New Roman" w:hAnsi="Times New Roman"/>
+          <w:sz w:val="24"/>
+          <w:szCs w:val="24"/>
+        </w:rPr>
+        <w:t xml:space="preserve">Among active samplers, the Andersen six-stage cascade impactor is widely regarded as a reference standard because it fractionates airborne particles by aerodynamic diameter, allowing the investigator to determine the size distribution of collected fungal spores and to distinguish between respirable and non-respirable fractions (Burge, 1990). Single-stage impactors such as the SAS and RCS samplers are simpler and more portable but provide only a total count without size fractionation. Filter samplers, which trap airborne particles on a membrane filter, offer the advantage of being silent in operation (unlike impactors, which can generate noise) and can be used for both culture-based and molecular analyses of collected material, but they require post-sampling extraction procedures that add processing time and may reduce recovery efficiency (Khan and Mohan Karuppayil, 2012). Impingers, which capture airborne particles in a liquid collection medium, are less commonly used for fungal sampling but remain the standard for bacterial bioaerosol assessment in some regulatory frameworks. The choice of sampler type in any given study depends on the research question, the available budget, and the practical constraints of the sampling environment.</w:t>
+      </w:r>
+    </w:p>
+    <w:p>
+      <w:pPr>
         <w:spacing w:before="240" w:after="120"/>
       </w:pPr>
       <w:r>
@@ -762,6 +805,20 @@
         <w:rPr>
           <w:rFonts w:ascii="Times New Roman" w:hAnsi="Times New Roman"/>
           <w:sz w:val="24"/>
+          <w:szCs w:val="24"/>
+        </w:rPr>
+        <w:t xml:space="preserve">Despite the clear advantages of molecular methods, their adoption in routine indoor air quality surveys in sub-Saharan Africa remains limited by several practical barriers. PCR reagents, DNA extraction kits, and sequencing services are expensive and often require importation, which introduces delays and adds cost. The infrastructure needed to run and maintain PCR laboratories, including reliable electricity, temperature-controlled storage, and skilled personnel, is not universally available (Tomazin and Matos, 2024). There is also the question of interpretation: molecular methods can detect fungal DNA from both viable and non-viable organisms, which means that a positive result does not necessarily indicate the presence of live, potentially growing fungi. Culture-based methods, by contrast, detect only viable propagules and provide isolates that can be archived for further study. For these reasons, the combination of culture-based isolation with morphological identification remains the approach most commonly used in Nigerian indoor aeromycological studies (Madukasi et al., 2021; Eze et al., 2021), and it is the approach adopted in the present study.</w:t>
+      </w:r>
+    </w:p>
+    <w:p>
+      <w:pPr>
+        <w:ind w:firstLine="720"/>
+        <w:jc w:val="both"/>
+      </w:pPr>
+      <w:r>
+        <w:rPr>
+          <w:rFonts w:ascii="Times New Roman" w:hAnsi="Times New Roman"/>
+          <w:sz w:val="24"/>
         </w:rPr>
         <w:t>It is important to acknowledge that morphological identification, while widely used, has limitations. Many fungal species share similar or overlapping morphological features, and definitive species-level identification for some groups may require molecular methods such as PCR amplification and sequencing of the internal transcribed spacer (ITS) region of ribosomal DNA, beta-tubulin, calmodulin, or RNA polymerase II genes (Houbraken et al., 2020; Tomazin and Matos, 2024). Nevertheless, for the purposes of a baseline indoor air quality survey in which the goal is to identify the major genera and common species present, morphological methods remain adequate and are the approach most accessible to laboratories in sub-Saharan Africa (Madukasi et al., 2021).</w:t>
       </w:r>
@@ -815,7 +872,7 @@
           <w:rFonts w:ascii="Times New Roman" w:hAnsi="Times New Roman"/>
           <w:sz w:val="24"/>
         </w:rPr>
-        <w:t>In Taiwan, Kallawicha et al. (2017) monitored ambient fungal spore concentrations at a primary school and found that spore levels peaked in the late morning and were positively correlated with both temperature and relative humidity. Their data showed that Cladosporium, Aspergillus, and Penicillium accounted for the majority of airborne spores throughout the year. Fan et al. (2021) surveyed fungal contamination in homes with children across six major Chinese cities and reported that Penicillium and Aspergillus were the dominant genera indoors, with their prevalence increasing significantly in rooms with visible dampness or water damage. In Turkey, studies of university classrooms have similarly reported Aspergillus, Penicillium, and Cladosporium as the predominant genera, with seasonal variation linked to changes in outdoor temperature and humidity (Akgun and Beckett, 2010).</w:t>
+        <w:t>Research on indoor fungal contamination in sub-Saharan Africa has expanded in recent years but remains thin relative to the volume of work from Europe, North America, and East Asia. The studies that have been conducted span a range of building types, including hospitals, residential homes, markets, and educational institutions, and have been carried out in countries such as Nigeria, Ghana, South Africa, Kenya, and Ethiopia. Across these diverse settings, a broadly consistent pattern emerges: Aspergillus and Penicillium are the dominant indoor genera, fungal loads tend to be higher in buildings with natural ventilation and during wet seasons, and the species profiles recovered indoors largely reflect the outdoor air spora of the surrounding region (Adhikari et al., 2004; Odebode et al., 2020). Within Nigeria specifically, the studies that exist have produced findings that are remarkably consistent with one another, despite having been conducted in different cities, building types, and climatic zones.</w:t>
       </w:r>
     </w:p>
     <w:p>
@@ -841,7 +898,7 @@
           <w:rFonts w:ascii="Times New Roman" w:hAnsi="Times New Roman"/>
           <w:sz w:val="24"/>
         </w:rPr>
-        <w:t>Research on indoor fungal contamination in sub-Saharan Africa has expanded in recent years but remains thin relative to the volume of work from Europe, North America, and East Asia. In Nigeria specifically, the studies that exist have produced broadly consistent findings regarding the dominant fungal genera in indoor air, even though they have been conducted in different cities, building types, and climatic zones.</w:t>
+        <w:t>Odebode et al. (2020) surveyed airborne fungal spores at five locations across Lagos, including residential, commercial, and industrial areas, and reported Aspergillus and Penicillium as the dominant genera. Their study documented seasonal variation, with higher spore loads during the rainy season, and noted that indoor samples generally reflected the outdoor spore profile but at lower concentrations. Eze et al. (2021) focused specifically on crowded indoor spaces in Port Harcourt and recovered Aspergillus, Penicillium, Cladosporium, Rhizopus, and Mucor from air samples collected at markets, transport terminals, and similar high-occupancy locations. They reported that Aspergillus species, particularly A. niger and A. flavus, were the most frequently isolated fungi across all sites sampled.</w:t>
       </w:r>
     </w:p>
     <w:p>
@@ -853,8 +910,9 @@
         <w:rPr>
           <w:rFonts w:ascii="Times New Roman" w:hAnsi="Times New Roman"/>
           <w:sz w:val="24"/>
+          <w:szCs w:val="24"/>
         </w:rPr>
-        <w:t>Odebode et al. (2020) surveyed airborne fungal spores at five locations across Lagos, including residential, commercial, and industrial areas, and reported Aspergillus and Penicillium as the dominant genera. Their study documented seasonal variation, with higher spore loads during the rainy season, and noted that indoor samples generally reflected the outdoor spore profile but at lower concentrations. Eze et al. (2021) focused specifically on crowded indoor spaces in Port Harcourt and recovered Aspergillus, Penicillium, Cladosporium, Rhizopus, and Mucor from air samples collected at markets, transport terminals, and similar high-occupancy locations. They reported that Aspergillus species, particularly A. niger and A. flavus, were the most frequently isolated fungi across all sites sampled.</w:t>
+        <w:t xml:space="preserve">A notable gap in the Nigerian literature is the absence of data from Abuja and the north-central region of the country. Abuja's geographic position in Nigeria's middle belt gives it a climate that is transitional between the humid tropical south and the drier savanna north, with a distinct wet season from April to October and a dry season from November to March. The indoor fungal communities of buildings in this ecotone may differ in composition and abundance from those reported in the more extensively studied southern cities. Furthermore, the rapid urbanisation of Abuja over the past two decades has led to the construction of large numbers of academic, commercial, and residential buildings, many of which rely on natural ventilation due to the high cost and intermittent availability of electricity for air-conditioning. These local conditions create a specific set of environmental pressures on indoor fungal ecology that have not, to date, been systematically documented in the aeromycological literature.</w:t>
       </w:r>
     </w:p>
     <w:p>

</xml_diff>